<commit_message>
Converte CT-Informatica-Internet-1000-SENAI-SED-2026.pdf para Markdown
</commit_message>
<xml_diff>
--- a/sistema/BANCO_DE_DADOS/Avaliação prática banco de dados.docx
+++ b/sistema/BANCO_DE_DADOS/Avaliação prática banco de dados.docx
@@ -1,6 +1,6 @@
 
 <file path=word/document.xml><?xml version="1.0" encoding="utf-8"?>
-<w:document xmlns:wpc="http://schemas.microsoft.com/office/word/2010/wordprocessingCanvas" xmlns:cx="http://schemas.microsoft.com/office/drawing/2014/chartex" xmlns:cx1="http://schemas.microsoft.com/office/drawing/2015/9/8/chartex" xmlns:cx2="http://schemas.microsoft.com/office/drawing/2015/10/21/chartex" xmlns:cx3="http://schemas.microsoft.com/office/drawing/2016/5/9/chartex" xmlns:cx4="http://schemas.microsoft.com/office/drawing/2016/5/10/chartex" xmlns:cx5="http://schemas.microsoft.com/office/drawing/2016/5/11/chartex" xmlns:cx6="http://schemas.microsoft.com/office/drawing/2016/5/12/chartex" xmlns:cx7="http://schemas.microsoft.com/office/drawing/2016/5/13/chartex" xmlns:cx8="http://schemas.microsoft.com/office/drawing/2016/5/14/chartex" xmlns:mc="http://schemas.openxmlformats.org/markup-compatibility/2006" xmlns:aink="http://schemas.microsoft.com/office/drawing/2016/ink" xmlns:am3d="http://schemas.microsoft.com/office/drawing/2017/model3d" xmlns:o="urn:schemas-microsoft-com:office:office" xmlns:oel="http://schemas.microsoft.com/office/2019/extlst" xmlns:r="http://schemas.openxmlformats.org/officeDocument/2006/relationships" xmlns:m="http://schemas.openxmlformats.org/officeDocument/2006/math" xmlns:v="urn:schemas-microsoft-com:vml" xmlns:wp14="http://schemas.microsoft.com/office/word/2010/wordprocessingDrawing" xmlns:wp="http://schemas.openxmlformats.org/drawingml/2006/wordprocessingDrawing" xmlns:w10="urn:schemas-microsoft-com:office:word" xmlns:w="http://schemas.openxmlformats.org/wordprocessingml/2006/main" xmlns:w14="http://schemas.microsoft.com/office/word/2010/wordml" xmlns:w15="http://schemas.microsoft.com/office/word/2012/wordml" xmlns:w16cex="http://schemas.microsoft.com/office/word/2018/wordml/cex" xmlns:w16cid="http://schemas.microsoft.com/office/word/2016/wordml/cid" xmlns:w16="http://schemas.microsoft.com/office/word/2018/wordml" xmlns:w16sdtdh="http://schemas.microsoft.com/office/word/2020/wordml/sdtdatahash" xmlns:w16se="http://schemas.microsoft.com/office/word/2015/wordml/symex" xmlns:wpg="http://schemas.microsoft.com/office/word/2010/wordprocessingGroup" xmlns:wpi="http://schemas.microsoft.com/office/word/2010/wordprocessingInk" xmlns:wne="http://schemas.microsoft.com/office/word/2006/wordml" xmlns:wps="http://schemas.microsoft.com/office/word/2010/wordprocessingShape" mc:Ignorable="w14 w15 w16se w16cid w16 w16cex w16sdtdh wp14">
+<w:document xmlns:wpc="http://schemas.microsoft.com/office/word/2010/wordprocessingCanvas" xmlns:cx="http://schemas.microsoft.com/office/drawing/2014/chartex" xmlns:cx1="http://schemas.microsoft.com/office/drawing/2015/9/8/chartex" xmlns:cx2="http://schemas.microsoft.com/office/drawing/2015/10/21/chartex" xmlns:cx3="http://schemas.microsoft.com/office/drawing/2016/5/9/chartex" xmlns:cx4="http://schemas.microsoft.com/office/drawing/2016/5/10/chartex" xmlns:cx5="http://schemas.microsoft.com/office/drawing/2016/5/11/chartex" xmlns:cx6="http://schemas.microsoft.com/office/drawing/2016/5/12/chartex" xmlns:cx7="http://schemas.microsoft.com/office/drawing/2016/5/13/chartex" xmlns:cx8="http://schemas.microsoft.com/office/drawing/2016/5/14/chartex" xmlns:mc="http://schemas.openxmlformats.org/markup-compatibility/2006" xmlns:aink="http://schemas.microsoft.com/office/drawing/2016/ink" xmlns:am3d="http://schemas.microsoft.com/office/drawing/2017/model3d" xmlns:o="urn:schemas-microsoft-com:office:office" xmlns:oel="http://schemas.microsoft.com/office/2019/extlst" xmlns:r="http://schemas.openxmlformats.org/officeDocument/2006/relationships" xmlns:m="http://schemas.openxmlformats.org/officeDocument/2006/math" xmlns:v="urn:schemas-microsoft-com:vml" xmlns:wp14="http://schemas.microsoft.com/office/word/2010/wordprocessingDrawing" xmlns:wp="http://schemas.openxmlformats.org/drawingml/2006/wordprocessingDrawing" xmlns:w10="urn:schemas-microsoft-com:office:word" xmlns:w="http://schemas.openxmlformats.org/wordprocessingml/2006/main" xmlns:w14="http://schemas.microsoft.com/office/word/2010/wordml" xmlns:w15="http://schemas.microsoft.com/office/word/2012/wordml" xmlns:w16cex="http://schemas.microsoft.com/office/word/2018/wordml/cex" xmlns:w16cid="http://schemas.microsoft.com/office/word/2016/wordml/cid" xmlns:w16="http://schemas.microsoft.com/office/word/2018/wordml" xmlns:w16du="http://schemas.microsoft.com/office/word/2023/wordml/word16du" xmlns:w16sdtdh="http://schemas.microsoft.com/office/word/2020/wordml/sdtdatahash" xmlns:w16sdtfl="http://schemas.microsoft.com/office/word/2024/wordml/sdtformatlock" xmlns:w16se="http://schemas.microsoft.com/office/word/2015/wordml/symex" xmlns:wpg="http://schemas.microsoft.com/office/word/2010/wordprocessingGroup" xmlns:wpi="http://schemas.microsoft.com/office/word/2010/wordprocessingInk" xmlns:wne="http://schemas.microsoft.com/office/word/2006/wordml" xmlns:wps="http://schemas.microsoft.com/office/word/2010/wordprocessingShape" mc:Ignorable="w14 w15 w16se w16cid w16 w16cex w16sdtdh w16sdtfl w16du wp14">
   <w:body>
     <w:p>
       <w:pPr>
@@ -1127,7 +1127,25 @@
                 <w:sz w:val="20"/>
                 <w:szCs w:val="20"/>
               </w:rPr>
-              <w:t xml:space="preserve">CT5 Instalar sistema de gerenciamento de banco de dados (sgbd) conforme especificações para funcionamento do banco de dados. </w:t>
+              <w:t>CT5 Instalar sistema de gerenciamento de banco de dados (</w:t>
+            </w:r>
+            <w:proofErr w:type="spellStart"/>
+            <w:r>
+              <w:rPr>
+                <w:rFonts w:ascii="Arial" w:eastAsia="Arial" w:hAnsi="Arial" w:cs="Arial"/>
+                <w:sz w:val="20"/>
+                <w:szCs w:val="20"/>
+              </w:rPr>
+              <w:t>sgbd</w:t>
+            </w:r>
+            <w:proofErr w:type="spellEnd"/>
+            <w:r>
+              <w:rPr>
+                <w:rFonts w:ascii="Arial" w:eastAsia="Arial" w:hAnsi="Arial" w:cs="Arial"/>
+                <w:sz w:val="20"/>
+                <w:szCs w:val="20"/>
+              </w:rPr>
+              <w:t xml:space="preserve">) conforme especificações para funcionamento do banco de dados. </w:t>
             </w:r>
           </w:p>
           <w:p>
@@ -1190,7 +1208,25 @@
                 <w:sz w:val="20"/>
                 <w:szCs w:val="20"/>
               </w:rPr>
-              <w:t xml:space="preserve">CT8 Aplicar procedimentos de segurança e backup no sgbd. </w:t>
+              <w:t xml:space="preserve">CT8 Aplicar procedimentos de segurança e backup no </w:t>
+            </w:r>
+            <w:proofErr w:type="spellStart"/>
+            <w:r>
+              <w:rPr>
+                <w:rFonts w:ascii="Arial" w:eastAsia="Arial" w:hAnsi="Arial" w:cs="Arial"/>
+                <w:sz w:val="20"/>
+                <w:szCs w:val="20"/>
+              </w:rPr>
+              <w:t>sgbd</w:t>
+            </w:r>
+            <w:proofErr w:type="spellEnd"/>
+            <w:r>
+              <w:rPr>
+                <w:rFonts w:ascii="Arial" w:eastAsia="Arial" w:hAnsi="Arial" w:cs="Arial"/>
+                <w:sz w:val="20"/>
+                <w:szCs w:val="20"/>
+              </w:rPr>
+              <w:t xml:space="preserve">. </w:t>
             </w:r>
           </w:p>
           <w:p>
@@ -2145,15 +2181,7 @@
                 <w:sz w:val="20"/>
                 <w:szCs w:val="20"/>
               </w:rPr>
-              <w:t>Cada</w:t>
-            </w:r>
-            <w:r>
-              <w:rPr>
-                <w:rFonts w:ascii="Arial" w:eastAsia="Arial" w:hAnsi="Arial" w:cs="Arial"/>
-                <w:sz w:val="20"/>
-                <w:szCs w:val="20"/>
-              </w:rPr>
-              <w:t xml:space="preserve"> Técnico em Desenvolvimento de Sistemas foi contratado para desenvolver um dos projetos propostos à uma aplicação funcional que atenda às necessidades do cliente, assegurando qualidade, integridade, usabilidade e segurança das informações tratadas.</w:t>
+              <w:t>Cada Técnico em Desenvolvimento de Sistemas foi contratado para desenvolver um dos projetos propostos à uma aplicação funcional que atenda às necessidades do cliente, assegurando qualidade, integridade, usabilidade e segurança das informações tratadas.</w:t>
             </w:r>
           </w:p>
         </w:tc>
@@ -2277,7 +2305,15 @@
                 <w:sz w:val="20"/>
                 <w:szCs w:val="20"/>
               </w:rPr>
-              <w:t xml:space="preserve">Modelo conceitual, Modelo Lógico e Físico (SQM </w:t>
+              <w:t>Modelo conceitual, Modelo Lógico e Físico (SQM</w:t>
+            </w:r>
+            <w:r>
+              <w:rPr>
+                <w:rFonts w:ascii="Arial" w:eastAsia="Arial" w:hAnsi="Arial" w:cs="Arial"/>
+                <w:sz w:val="20"/>
+                <w:szCs w:val="20"/>
+              </w:rPr>
+              <w:t>)</w:t>
             </w:r>
           </w:p>
           <w:p>
@@ -2310,8 +2346,18 @@
                 <w:sz w:val="20"/>
                 <w:szCs w:val="20"/>
               </w:rPr>
-              <w:t xml:space="preserve"> no xampp</w:t>
-            </w:r>
+              <w:t xml:space="preserve"> no </w:t>
+            </w:r>
+            <w:proofErr w:type="spellStart"/>
+            <w:r>
+              <w:rPr>
+                <w:rFonts w:ascii="Arial" w:eastAsia="Arial" w:hAnsi="Arial" w:cs="Arial"/>
+                <w:sz w:val="20"/>
+                <w:szCs w:val="20"/>
+              </w:rPr>
+              <w:t>xampp</w:t>
+            </w:r>
+            <w:proofErr w:type="spellEnd"/>
             <w:r>
               <w:rPr>
                 <w:rFonts w:ascii="Arial" w:eastAsia="Arial" w:hAnsi="Arial" w:cs="Arial"/>
@@ -3768,7 +3814,25 @@
                 <w:sz w:val="20"/>
                 <w:szCs w:val="20"/>
               </w:rPr>
-              <w:t>Classificou os SGBDs apresentados segundo tipo e finalidade de aplicação?</w:t>
+              <w:t xml:space="preserve">Classificou os </w:t>
+            </w:r>
+            <w:proofErr w:type="spellStart"/>
+            <w:r>
+              <w:rPr>
+                <w:rFonts w:ascii="Arial" w:eastAsia="Arial" w:hAnsi="Arial" w:cs="Arial"/>
+                <w:sz w:val="20"/>
+                <w:szCs w:val="20"/>
+              </w:rPr>
+              <w:t>SGBDs</w:t>
+            </w:r>
+            <w:proofErr w:type="spellEnd"/>
+            <w:r>
+              <w:rPr>
+                <w:rFonts w:ascii="Arial" w:eastAsia="Arial" w:hAnsi="Arial" w:cs="Arial"/>
+                <w:sz w:val="20"/>
+                <w:szCs w:val="20"/>
+              </w:rPr>
+              <w:t xml:space="preserve"> apresentados segundo tipo e finalidade de aplicação?</w:t>
             </w:r>
           </w:p>
         </w:tc>
@@ -3886,7 +3950,25 @@
                 <w:sz w:val="20"/>
                 <w:szCs w:val="20"/>
               </w:rPr>
-              <w:t>Descreveu as funcionalidades e limitações dos SGBDs analisados com base em documentação técnica ou fontes confiáveis?</w:t>
+              <w:t xml:space="preserve">Descreveu as funcionalidades e limitações dos </w:t>
+            </w:r>
+            <w:proofErr w:type="spellStart"/>
+            <w:r>
+              <w:rPr>
+                <w:rFonts w:ascii="Arial" w:eastAsia="Arial" w:hAnsi="Arial" w:cs="Arial"/>
+                <w:sz w:val="20"/>
+                <w:szCs w:val="20"/>
+              </w:rPr>
+              <w:t>SGBDs</w:t>
+            </w:r>
+            <w:proofErr w:type="spellEnd"/>
+            <w:r>
+              <w:rPr>
+                <w:rFonts w:ascii="Arial" w:eastAsia="Arial" w:hAnsi="Arial" w:cs="Arial"/>
+                <w:sz w:val="20"/>
+                <w:szCs w:val="20"/>
+              </w:rPr>
+              <w:t xml:space="preserve"> analisados com base em documentação técnica ou fontes confiáveis?</w:t>
             </w:r>
           </w:p>
         </w:tc>
@@ -12660,7 +12742,25 @@
                 <w:sz w:val="20"/>
                 <w:szCs w:val="20"/>
               </w:rPr>
-              <w:t>Aplicou uma solução de backup básica (ex: completo semanal, incremental diário) que solucione a necessidade de recuperação de desastres para a estrutura normalizada?</w:t>
+              <w:t>Aplicou uma solução de backup básica (</w:t>
+            </w:r>
+            <w:proofErr w:type="spellStart"/>
+            <w:r>
+              <w:rPr>
+                <w:rFonts w:ascii="Arial" w:eastAsia="Arial" w:hAnsi="Arial" w:cs="Arial"/>
+                <w:sz w:val="20"/>
+                <w:szCs w:val="20"/>
+              </w:rPr>
+              <w:t>ex</w:t>
+            </w:r>
+            <w:proofErr w:type="spellEnd"/>
+            <w:r>
+              <w:rPr>
+                <w:rFonts w:ascii="Arial" w:eastAsia="Arial" w:hAnsi="Arial" w:cs="Arial"/>
+                <w:sz w:val="20"/>
+                <w:szCs w:val="20"/>
+              </w:rPr>
+              <w:t>: completo semanal, incremental diário) que solucione a necessidade de recuperação de desastres para a estrutura normalizada?</w:t>
             </w:r>
           </w:p>
         </w:tc>
@@ -12908,7 +13008,43 @@
                 <w:sz w:val="20"/>
                 <w:szCs w:val="20"/>
               </w:rPr>
-              <w:t>Nomear os comandos DDL (Data Definition Language) básicos (CREATE, DROP, ALTER) necessários para a definição das tabelas normalizadas.</w:t>
+              <w:t xml:space="preserve">Nomear os comandos DDL (Data </w:t>
+            </w:r>
+            <w:proofErr w:type="spellStart"/>
+            <w:r>
+              <w:rPr>
+                <w:rFonts w:ascii="Arial" w:eastAsia="Arial" w:hAnsi="Arial" w:cs="Arial"/>
+                <w:sz w:val="20"/>
+                <w:szCs w:val="20"/>
+              </w:rPr>
+              <w:t>Definition</w:t>
+            </w:r>
+            <w:proofErr w:type="spellEnd"/>
+            <w:r>
+              <w:rPr>
+                <w:rFonts w:ascii="Arial" w:eastAsia="Arial" w:hAnsi="Arial" w:cs="Arial"/>
+                <w:sz w:val="20"/>
+                <w:szCs w:val="20"/>
+              </w:rPr>
+              <w:t xml:space="preserve"> </w:t>
+            </w:r>
+            <w:proofErr w:type="spellStart"/>
+            <w:r>
+              <w:rPr>
+                <w:rFonts w:ascii="Arial" w:eastAsia="Arial" w:hAnsi="Arial" w:cs="Arial"/>
+                <w:sz w:val="20"/>
+                <w:szCs w:val="20"/>
+              </w:rPr>
+              <w:t>Language</w:t>
+            </w:r>
+            <w:proofErr w:type="spellEnd"/>
+            <w:r>
+              <w:rPr>
+                <w:rFonts w:ascii="Arial" w:eastAsia="Arial" w:hAnsi="Arial" w:cs="Arial"/>
+                <w:sz w:val="20"/>
+                <w:szCs w:val="20"/>
+              </w:rPr>
+              <w:t>) básicos (CREATE, DROP, ALTER) necessários para a definição das tabelas normalizadas.</w:t>
             </w:r>
           </w:p>
         </w:tc>
@@ -14768,7 +14904,25 @@
                 <w:sz w:val="20"/>
                 <w:szCs w:val="20"/>
               </w:rPr>
-              <w:t>CT4 Documento técnico lista SGBDs compatíveis com os requisitos do sistema apresentado?</w:t>
+              <w:t xml:space="preserve">CT4 Documento técnico lista </w:t>
+            </w:r>
+            <w:proofErr w:type="spellStart"/>
+            <w:r>
+              <w:rPr>
+                <w:rFonts w:ascii="Arial" w:eastAsia="Arial" w:hAnsi="Arial" w:cs="Arial"/>
+                <w:sz w:val="20"/>
+                <w:szCs w:val="20"/>
+              </w:rPr>
+              <w:t>SGBDs</w:t>
+            </w:r>
+            <w:proofErr w:type="spellEnd"/>
+            <w:r>
+              <w:rPr>
+                <w:rFonts w:ascii="Arial" w:eastAsia="Arial" w:hAnsi="Arial" w:cs="Arial"/>
+                <w:sz w:val="20"/>
+                <w:szCs w:val="20"/>
+              </w:rPr>
+              <w:t xml:space="preserve"> compatíveis com os requisitos do sistema apresentado?</w:t>
             </w:r>
           </w:p>
         </w:tc>
@@ -14882,7 +15036,25 @@
                 <w:sz w:val="20"/>
                 <w:szCs w:val="20"/>
               </w:rPr>
-              <w:t>CT4 Documento técnico descreve funcionalidades e limitações dos SGBDs conforme documentação técnica?</w:t>
+              <w:t xml:space="preserve">CT4 Documento técnico descreve funcionalidades e limitações dos </w:t>
+            </w:r>
+            <w:proofErr w:type="spellStart"/>
+            <w:r>
+              <w:rPr>
+                <w:rFonts w:ascii="Arial" w:eastAsia="Arial" w:hAnsi="Arial" w:cs="Arial"/>
+                <w:sz w:val="20"/>
+                <w:szCs w:val="20"/>
+              </w:rPr>
+              <w:t>SGBDs</w:t>
+            </w:r>
+            <w:proofErr w:type="spellEnd"/>
+            <w:r>
+              <w:rPr>
+                <w:rFonts w:ascii="Arial" w:eastAsia="Arial" w:hAnsi="Arial" w:cs="Arial"/>
+                <w:sz w:val="20"/>
+                <w:szCs w:val="20"/>
+              </w:rPr>
+              <w:t xml:space="preserve"> conforme documentação técnica?</w:t>
             </w:r>
           </w:p>
         </w:tc>
@@ -15576,7 +15748,25 @@
                 <w:sz w:val="20"/>
                 <w:szCs w:val="20"/>
               </w:rPr>
-              <w:t>CT7 Há no Documento técnico as  técnicas  de modelagem de dados utilizadas na  construção dos DERs esquemas relacionais?</w:t>
+              <w:t xml:space="preserve">CT7 Há no Documento técnico as  técnicas  de modelagem de dados utilizadas na  construção dos </w:t>
+            </w:r>
+            <w:proofErr w:type="spellStart"/>
+            <w:r>
+              <w:rPr>
+                <w:rFonts w:ascii="Arial" w:eastAsia="Arial" w:hAnsi="Arial" w:cs="Arial"/>
+                <w:sz w:val="20"/>
+                <w:szCs w:val="20"/>
+              </w:rPr>
+              <w:t>DERs</w:t>
+            </w:r>
+            <w:proofErr w:type="spellEnd"/>
+            <w:r>
+              <w:rPr>
+                <w:rFonts w:ascii="Arial" w:eastAsia="Arial" w:hAnsi="Arial" w:cs="Arial"/>
+                <w:sz w:val="20"/>
+                <w:szCs w:val="20"/>
+              </w:rPr>
+              <w:t xml:space="preserve"> esquemas relacionais?</w:t>
             </w:r>
           </w:p>
         </w:tc>
@@ -16550,7 +16740,25 @@
                 <w:sz w:val="20"/>
                 <w:szCs w:val="20"/>
               </w:rPr>
-              <w:t>CT10 Há Documento técnico  a descrição das ferramentas e ambientes de execução SQL compatíveis com os SGBDs selecionados?</w:t>
+              <w:t xml:space="preserve">CT10 Há Documento técnico  a descrição das ferramentas e ambientes de execução SQL compatíveis com os </w:t>
+            </w:r>
+            <w:proofErr w:type="spellStart"/>
+            <w:r>
+              <w:rPr>
+                <w:rFonts w:ascii="Arial" w:eastAsia="Arial" w:hAnsi="Arial" w:cs="Arial"/>
+                <w:sz w:val="20"/>
+                <w:szCs w:val="20"/>
+              </w:rPr>
+              <w:t>SGBDs</w:t>
+            </w:r>
+            <w:proofErr w:type="spellEnd"/>
+            <w:r>
+              <w:rPr>
+                <w:rFonts w:ascii="Arial" w:eastAsia="Arial" w:hAnsi="Arial" w:cs="Arial"/>
+                <w:sz w:val="20"/>
+                <w:szCs w:val="20"/>
+              </w:rPr>
+              <w:t xml:space="preserve"> selecionados?</w:t>
             </w:r>
           </w:p>
         </w:tc>
@@ -17487,7 +17695,43 @@
                 <w:sz w:val="20"/>
                 <w:szCs w:val="20"/>
               </w:rPr>
-              <w:t>CT11 Elaborou o código DDL (Data Definition Language) com a sintaxe SQL correta para criar todas as tabelas normalizadas, definindo apropriadamente chaves primárias e estrangeiras?</w:t>
+              <w:t xml:space="preserve">CT11 Elaborou o código DDL (Data </w:t>
+            </w:r>
+            <w:proofErr w:type="spellStart"/>
+            <w:r>
+              <w:rPr>
+                <w:rFonts w:ascii="Arial" w:eastAsia="Arial" w:hAnsi="Arial" w:cs="Arial"/>
+                <w:sz w:val="20"/>
+                <w:szCs w:val="20"/>
+              </w:rPr>
+              <w:t>Definition</w:t>
+            </w:r>
+            <w:proofErr w:type="spellEnd"/>
+            <w:r>
+              <w:rPr>
+                <w:rFonts w:ascii="Arial" w:eastAsia="Arial" w:hAnsi="Arial" w:cs="Arial"/>
+                <w:sz w:val="20"/>
+                <w:szCs w:val="20"/>
+              </w:rPr>
+              <w:t xml:space="preserve"> </w:t>
+            </w:r>
+            <w:proofErr w:type="spellStart"/>
+            <w:r>
+              <w:rPr>
+                <w:rFonts w:ascii="Arial" w:eastAsia="Arial" w:hAnsi="Arial" w:cs="Arial"/>
+                <w:sz w:val="20"/>
+                <w:szCs w:val="20"/>
+              </w:rPr>
+              <w:t>Language</w:t>
+            </w:r>
+            <w:proofErr w:type="spellEnd"/>
+            <w:r>
+              <w:rPr>
+                <w:rFonts w:ascii="Arial" w:eastAsia="Arial" w:hAnsi="Arial" w:cs="Arial"/>
+                <w:sz w:val="20"/>
+                <w:szCs w:val="20"/>
+              </w:rPr>
+              <w:t>) com a sintaxe SQL correta para criar todas as tabelas normalizadas, definindo apropriadamente chaves primárias e estrangeiras?</w:t>
             </w:r>
           </w:p>
         </w:tc>
@@ -19560,7 +19804,7 @@
 </file>
 
 <file path=word/numbering.xml><?xml version="1.0" encoding="utf-8"?>
-<w:numbering xmlns:wpc="http://schemas.microsoft.com/office/word/2010/wordprocessingCanvas" xmlns:cx="http://schemas.microsoft.com/office/drawing/2014/chartex" xmlns:cx1="http://schemas.microsoft.com/office/drawing/2015/9/8/chartex" xmlns:cx2="http://schemas.microsoft.com/office/drawing/2015/10/21/chartex" xmlns:cx3="http://schemas.microsoft.com/office/drawing/2016/5/9/chartex" xmlns:cx4="http://schemas.microsoft.com/office/drawing/2016/5/10/chartex" xmlns:cx5="http://schemas.microsoft.com/office/drawing/2016/5/11/chartex" xmlns:cx6="http://schemas.microsoft.com/office/drawing/2016/5/12/chartex" xmlns:cx7="http://schemas.microsoft.com/office/drawing/2016/5/13/chartex" xmlns:cx8="http://schemas.microsoft.com/office/drawing/2016/5/14/chartex" xmlns:mc="http://schemas.openxmlformats.org/markup-compatibility/2006" xmlns:aink="http://schemas.microsoft.com/office/drawing/2016/ink" xmlns:am3d="http://schemas.microsoft.com/office/drawing/2017/model3d" xmlns:o="urn:schemas-microsoft-com:office:office" xmlns:oel="http://schemas.microsoft.com/office/2019/extlst" xmlns:r="http://schemas.openxmlformats.org/officeDocument/2006/relationships" xmlns:m="http://schemas.openxmlformats.org/officeDocument/2006/math" xmlns:v="urn:schemas-microsoft-com:vml" xmlns:wp14="http://schemas.microsoft.com/office/word/2010/wordprocessingDrawing" xmlns:wp="http://schemas.openxmlformats.org/drawingml/2006/wordprocessingDrawing" xmlns:w10="urn:schemas-microsoft-com:office:word" xmlns:w="http://schemas.openxmlformats.org/wordprocessingml/2006/main" xmlns:w14="http://schemas.microsoft.com/office/word/2010/wordml" xmlns:w15="http://schemas.microsoft.com/office/word/2012/wordml" xmlns:w16cex="http://schemas.microsoft.com/office/word/2018/wordml/cex" xmlns:w16cid="http://schemas.microsoft.com/office/word/2016/wordml/cid" xmlns:w16="http://schemas.microsoft.com/office/word/2018/wordml" xmlns:w16sdtdh="http://schemas.microsoft.com/office/word/2020/wordml/sdtdatahash" xmlns:w16se="http://schemas.microsoft.com/office/word/2015/wordml/symex" xmlns:wpg="http://schemas.microsoft.com/office/word/2010/wordprocessingGroup" xmlns:wpi="http://schemas.microsoft.com/office/word/2010/wordprocessingInk" xmlns:wne="http://schemas.microsoft.com/office/word/2006/wordml" xmlns:wps="http://schemas.microsoft.com/office/word/2010/wordprocessingShape" mc:Ignorable="w14 w15 w16se w16cid w16 w16cex w16sdtdh wp14">
+<w:numbering xmlns:wpc="http://schemas.microsoft.com/office/word/2010/wordprocessingCanvas" xmlns:cx="http://schemas.microsoft.com/office/drawing/2014/chartex" xmlns:cx1="http://schemas.microsoft.com/office/drawing/2015/9/8/chartex" xmlns:cx2="http://schemas.microsoft.com/office/drawing/2015/10/21/chartex" xmlns:cx3="http://schemas.microsoft.com/office/drawing/2016/5/9/chartex" xmlns:cx4="http://schemas.microsoft.com/office/drawing/2016/5/10/chartex" xmlns:cx5="http://schemas.microsoft.com/office/drawing/2016/5/11/chartex" xmlns:cx6="http://schemas.microsoft.com/office/drawing/2016/5/12/chartex" xmlns:cx7="http://schemas.microsoft.com/office/drawing/2016/5/13/chartex" xmlns:cx8="http://schemas.microsoft.com/office/drawing/2016/5/14/chartex" xmlns:mc="http://schemas.openxmlformats.org/markup-compatibility/2006" xmlns:aink="http://schemas.microsoft.com/office/drawing/2016/ink" xmlns:am3d="http://schemas.microsoft.com/office/drawing/2017/model3d" xmlns:o="urn:schemas-microsoft-com:office:office" xmlns:oel="http://schemas.microsoft.com/office/2019/extlst" xmlns:r="http://schemas.openxmlformats.org/officeDocument/2006/relationships" xmlns:m="http://schemas.openxmlformats.org/officeDocument/2006/math" xmlns:v="urn:schemas-microsoft-com:vml" xmlns:wp14="http://schemas.microsoft.com/office/word/2010/wordprocessingDrawing" xmlns:wp="http://schemas.openxmlformats.org/drawingml/2006/wordprocessingDrawing" xmlns:w10="urn:schemas-microsoft-com:office:word" xmlns:w="http://schemas.openxmlformats.org/wordprocessingml/2006/main" xmlns:w14="http://schemas.microsoft.com/office/word/2010/wordml" xmlns:w15="http://schemas.microsoft.com/office/word/2012/wordml" xmlns:w16cex="http://schemas.microsoft.com/office/word/2018/wordml/cex" xmlns:w16cid="http://schemas.microsoft.com/office/word/2016/wordml/cid" xmlns:w16="http://schemas.microsoft.com/office/word/2018/wordml" xmlns:w16du="http://schemas.microsoft.com/office/word/2023/wordml/word16du" xmlns:w16sdtdh="http://schemas.microsoft.com/office/word/2020/wordml/sdtdatahash" xmlns:w16sdtfl="http://schemas.microsoft.com/office/word/2024/wordml/sdtformatlock" xmlns:w16se="http://schemas.microsoft.com/office/word/2015/wordml/symex" xmlns:wpg="http://schemas.microsoft.com/office/word/2010/wordprocessingGroup" xmlns:wpi="http://schemas.microsoft.com/office/word/2010/wordprocessingInk" xmlns:wne="http://schemas.microsoft.com/office/word/2006/wordml" xmlns:wps="http://schemas.microsoft.com/office/word/2010/wordprocessingShape" mc:Ignorable="w14 w15 w16se w16cid w16 w16cex w16sdtdh w16sdtfl w16du wp14">
   <w:abstractNum w:abstractNumId="0" w15:restartNumberingAfterBreak="0">
     <w:nsid w:val="1C5E6F9D"/>
     <w:multiLevelType w:val="multilevel"/>
@@ -19913,7 +20157,7 @@
 </file>
 
 <file path=word/styles.xml><?xml version="1.0" encoding="utf-8"?>
-<w:styles xmlns:mc="http://schemas.openxmlformats.org/markup-compatibility/2006" xmlns:r="http://schemas.openxmlformats.org/officeDocument/2006/relationships" xmlns:w="http://schemas.openxmlformats.org/wordprocessingml/2006/main" xmlns:w14="http://schemas.microsoft.com/office/word/2010/wordml" xmlns:w15="http://schemas.microsoft.com/office/word/2012/wordml" xmlns:w16cex="http://schemas.microsoft.com/office/word/2018/wordml/cex" xmlns:w16cid="http://schemas.microsoft.com/office/word/2016/wordml/cid" xmlns:w16="http://schemas.microsoft.com/office/word/2018/wordml" xmlns:w16sdtdh="http://schemas.microsoft.com/office/word/2020/wordml/sdtdatahash" xmlns:w16se="http://schemas.microsoft.com/office/word/2015/wordml/symex" mc:Ignorable="w14 w15 w16se w16cid w16 w16cex w16sdtdh">
+<w:styles xmlns:mc="http://schemas.openxmlformats.org/markup-compatibility/2006" xmlns:r="http://schemas.openxmlformats.org/officeDocument/2006/relationships" xmlns:w="http://schemas.openxmlformats.org/wordprocessingml/2006/main" xmlns:w14="http://schemas.microsoft.com/office/word/2010/wordml" xmlns:w15="http://schemas.microsoft.com/office/word/2012/wordml" xmlns:w16cex="http://schemas.microsoft.com/office/word/2018/wordml/cex" xmlns:w16cid="http://schemas.microsoft.com/office/word/2016/wordml/cid" xmlns:w16="http://schemas.microsoft.com/office/word/2018/wordml" xmlns:w16du="http://schemas.microsoft.com/office/word/2023/wordml/word16du" xmlns:w16sdtdh="http://schemas.microsoft.com/office/word/2020/wordml/sdtdatahash" xmlns:w16sdtfl="http://schemas.microsoft.com/office/word/2024/wordml/sdtformatlock" xmlns:w16se="http://schemas.microsoft.com/office/word/2015/wordml/symex" mc:Ignorable="w14 w15 w16se w16cid w16 w16cex w16sdtdh w16sdtfl w16du">
   <w:docDefaults>
     <w:rPrDefault>
       <w:rPr>
@@ -20496,6 +20740,7 @@
   <w:style w:type="character" w:default="1" w:styleId="Fontepargpadro">
     <w:name w:val="Default Paragraph Font"/>
     <w:uiPriority w:val="1"/>
+    <w:semiHidden/>
     <w:unhideWhenUsed/>
   </w:style>
   <w:style w:type="table" w:default="1" w:styleId="Tabelanormal">

</xml_diff>